<commit_message>
Align canonical IAM portfolio files with approved corrections
</commit_message>
<xml_diff>
--- a/Northstar_HealthTech_IAM_Governance_Charter_v1.docx
+++ b/Northstar_HealthTech_IAM_Governance_Charter_v1.docx
@@ -1259,7 +1259,7 @@
         <w:pStyle w:val="FirstParagraph"/>
       </w:pPr>
       <w:r>
-        <w:t xml:space="preserve">Supporting artifacts to be drafted: JML procedure, RBAC matrix, access request and approval workflow, access certification register, privileged access standard, IAM risk register, control matrix, incident tabletop exercise, and implementation roadmap. All sample personnel and records must be fictional, with no real credentials or patient information.</w:t>
+        <w:t>At the original October 27 review, supporting artifacts were planned. As of October 28, 2026, this educational portfolio includes JML, access-request/approval, access-certification, IAM risk-register, dashboard, control-testing matrix, and control-testing simulation documents. Dedicated RBAC/privileged-access standards, incident tabletop exercises, and implementation-roadmap artifacts remain potential future extensions. All sample personnel and records must be fictional, with no real credentials or patient information.</w:t>
       </w:r>
     </w:p>
     <w:bookmarkEnd w:id="29"/>
@@ -1391,19 +1391,19 @@
               <w:jc w:val="left"/>
             </w:pPr>
             <w:r>
-              <w:t xml:space="preserve">GitHub publication</w:t>
-            </w:r>
-          </w:p>
-        </w:tc>
-        <w:tc>
-          <w:tcPr/>
-          <w:p>
-            <w:pPr>
-              <w:pStyle w:val="Compact"/>
-              <w:jc w:val="left"/>
-            </w:pPr>
-            <w:r>
-              <w:t xml:space="preserve">Not started</w:t>
+              <w:t>GitHub publication (Oct 27 snapshot)</w:t>
+            </w:r>
+          </w:p>
+        </w:tc>
+        <w:tc>
+          <w:tcPr/>
+          <w:p>
+            <w:pPr>
+              <w:pStyle w:val="Compact"/>
+              <w:jc w:val="left"/>
+            </w:pPr>
+            <w:r>
+              <w:t>Not started at Oct 27 review; published Oct 28, 2026 (subsequent update)</w:t>
             </w:r>
           </w:p>
         </w:tc>

</xml_diff>